<commit_message>
Actualiza el plan de cierre con lo hecho hoy: restauración automática, 3M consistente, resguardo en OneDrive y verificación de AlertOps
Suma cinco puntos a «Lo que ya funciona», cuatro filas en el estado de cada
pieza, y aclara la viñeta de SharePoint/OneDrive en «Lo que falta» para
distinguirla de RUTA_ONEDRIVE (ya resuelto). El anexo técnico suma
ejecutar.bat/ejecutar.ps1 y la mención de RUTA_ONEDRIVE en .env.
</commit_message>
<xml_diff>
--- a/Automatizacion GLPI - Plan de cierre.docx
+++ b/Automatizacion GLPI - Plan de cierre.docx
@@ -1145,6 +1145,330 @@
           </w:p>
         </w:tc>
       </w:tr>
+      <w:tr>
+        <w:tc>
+          <w:tcPr>
+            <w:tcW w:type="dxa" w:w="2000"/>
+            <w:tcMar>
+              <w:top w:type="dxa" w:w="100"/>
+              <w:left w:type="dxa" w:w="120"/>
+              <w:bottom w:type="dxa" w:w="100"/>
+              <w:right w:type="dxa" w:w="120"/>
+            </w:tcMar>
+          </w:tcPr>
+          <w:p>
+            <w:pPr>
+              <w:jc w:val="left"/>
+            </w:pPr>
+            <w:r>
+              <w:rPr>
+                <w:b w:val="false"/>
+                <w:bCs w:val="false"/>
+                <w:color w:val="000000"/>
+                <w:sz w:val="20"/>
+                <w:szCs w:val="20"/>
+              </w:rPr>
+              <w:t xml:space="preserve">Restauración automática de insumos guardados</w:t>
+            </w:r>
+          </w:p>
+        </w:tc>
+        <w:tc>
+          <w:tcPr>
+            <w:tcW w:type="dxa" w:w="2000"/>
+            <w:shd w:fill="E2EFDA" w:val="clear"/>
+            <w:tcMar>
+              <w:top w:type="dxa" w:w="100"/>
+              <w:left w:type="dxa" w:w="120"/>
+              <w:bottom w:type="dxa" w:w="100"/>
+              <w:right w:type="dxa" w:w="120"/>
+            </w:tcMar>
+          </w:tcPr>
+          <w:p>
+            <w:pPr>
+              <w:jc w:val="left"/>
+            </w:pPr>
+            <w:r>
+              <w:rPr>
+                <w:b w:val="false"/>
+                <w:bCs w:val="false"/>
+                <w:color w:val="000000"/>
+                <w:sz w:val="20"/>
+                <w:szCs w:val="20"/>
+              </w:rPr>
+              <w:t xml:space="preserve">Listo</w:t>
+            </w:r>
+          </w:p>
+        </w:tc>
+        <w:tc>
+          <w:tcPr>
+            <w:tcW w:type="dxa" w:w="2000"/>
+            <w:tcMar>
+              <w:top w:type="dxa" w:w="100"/>
+              <w:left w:type="dxa" w:w="120"/>
+              <w:bottom w:type="dxa" w:w="100"/>
+              <w:right w:type="dxa" w:w="120"/>
+            </w:tcMar>
+          </w:tcPr>
+          <w:p>
+            <w:pPr>
+              <w:jc w:val="left"/>
+            </w:pPr>
+            <w:r>
+              <w:rPr>
+                <w:b w:val="false"/>
+                <w:bCs w:val="false"/>
+                <w:color w:val="000000"/>
+                <w:sz w:val="20"/>
+                <w:szCs w:val="20"/>
+              </w:rPr>
+              <w:t xml:space="preserve">Consolidado/Logros/Mitigaciones ya no exigen apretar «Restaurar» tras recargar</w:t>
+            </w:r>
+          </w:p>
+        </w:tc>
+      </w:tr>
+      <w:tr>
+        <w:tc>
+          <w:tcPr>
+            <w:tcW w:type="dxa" w:w="2000"/>
+            <w:tcMar>
+              <w:top w:type="dxa" w:w="100"/>
+              <w:left w:type="dxa" w:w="120"/>
+              <w:bottom w:type="dxa" w:w="100"/>
+              <w:right w:type="dxa" w:w="120"/>
+            </w:tcMar>
+          </w:tcPr>
+          <w:p>
+            <w:pPr>
+              <w:jc w:val="left"/>
+            </w:pPr>
+            <w:r>
+              <w:rPr>
+                <w:b w:val="false"/>
+                <w:bCs w:val="false"/>
+                <w:color w:val="000000"/>
+                <w:sz w:val="20"/>
+                <w:szCs w:val="20"/>
+              </w:rPr>
+              <w:t xml:space="preserve">Filtro histórico 3M consistente en toda tarjeta</w:t>
+            </w:r>
+          </w:p>
+        </w:tc>
+        <w:tc>
+          <w:tcPr>
+            <w:tcW w:type="dxa" w:w="2000"/>
+            <w:shd w:fill="E2EFDA" w:val="clear"/>
+            <w:tcMar>
+              <w:top w:type="dxa" w:w="100"/>
+              <w:left w:type="dxa" w:w="120"/>
+              <w:bottom w:type="dxa" w:w="100"/>
+              <w:right w:type="dxa" w:w="120"/>
+            </w:tcMar>
+          </w:tcPr>
+          <w:p>
+            <w:pPr>
+              <w:jc w:val="left"/>
+            </w:pPr>
+            <w:r>
+              <w:rPr>
+                <w:b w:val="false"/>
+                <w:bCs w:val="false"/>
+                <w:color w:val="000000"/>
+                <w:sz w:val="20"/>
+                <w:szCs w:val="20"/>
+              </w:rPr>
+              <w:t xml:space="preserve">Listo</w:t>
+            </w:r>
+          </w:p>
+        </w:tc>
+        <w:tc>
+          <w:tcPr>
+            <w:tcW w:type="dxa" w:w="2000"/>
+            <w:tcMar>
+              <w:top w:type="dxa" w:w="100"/>
+              <w:left w:type="dxa" w:w="120"/>
+              <w:bottom w:type="dxa" w:w="100"/>
+              <w:right w:type="dxa" w:w="120"/>
+            </w:tcMar>
+          </w:tcPr>
+          <w:p>
+            <w:pPr>
+              <w:jc w:val="left"/>
+            </w:pPr>
+            <w:r>
+              <w:rPr>
+                <w:b w:val="false"/>
+                <w:bCs w:val="false"/>
+                <w:color w:val="000000"/>
+                <w:sz w:val="20"/>
+                <w:szCs w:val="20"/>
+              </w:rPr>
+              <w:t xml:space="preserve">Backups y Disponibilidad por CI arrancaban en «Todo»; ya quedan iguales al resto</w:t>
+            </w:r>
+          </w:p>
+        </w:tc>
+      </w:tr>
+      <w:tr>
+        <w:tc>
+          <w:tcPr>
+            <w:tcW w:type="dxa" w:w="2000"/>
+            <w:tcMar>
+              <w:top w:type="dxa" w:w="100"/>
+              <w:left w:type="dxa" w:w="120"/>
+              <w:bottom w:type="dxa" w:w="100"/>
+              <w:right w:type="dxa" w:w="120"/>
+            </w:tcMar>
+          </w:tcPr>
+          <w:p>
+            <w:pPr>
+              <w:jc w:val="left"/>
+            </w:pPr>
+            <w:r>
+              <w:rPr>
+                <w:b w:val="false"/>
+                <w:bCs w:val="false"/>
+                <w:color w:val="000000"/>
+                <w:sz w:val="20"/>
+                <w:szCs w:val="20"/>
+              </w:rPr>
+              <w:t xml:space="preserve">Copia de resguardo del CSV original</w:t>
+            </w:r>
+          </w:p>
+        </w:tc>
+        <w:tc>
+          <w:tcPr>
+            <w:tcW w:type="dxa" w:w="2000"/>
+            <w:shd w:fill="E2EFDA" w:val="clear"/>
+            <w:tcMar>
+              <w:top w:type="dxa" w:w="100"/>
+              <w:left w:type="dxa" w:w="120"/>
+              <w:bottom w:type="dxa" w:w="100"/>
+              <w:right w:type="dxa" w:w="120"/>
+            </w:tcMar>
+          </w:tcPr>
+          <w:p>
+            <w:pPr>
+              <w:jc w:val="left"/>
+            </w:pPr>
+            <w:r>
+              <w:rPr>
+                <w:b w:val="false"/>
+                <w:bCs w:val="false"/>
+                <w:color w:val="000000"/>
+                <w:sz w:val="20"/>
+                <w:szCs w:val="20"/>
+              </w:rPr>
+              <w:t xml:space="preserve">Listo</w:t>
+            </w:r>
+          </w:p>
+        </w:tc>
+        <w:tc>
+          <w:tcPr>
+            <w:tcW w:type="dxa" w:w="2000"/>
+            <w:tcMar>
+              <w:top w:type="dxa" w:w="100"/>
+              <w:left w:type="dxa" w:w="120"/>
+              <w:bottom w:type="dxa" w:w="100"/>
+              <w:right w:type="dxa" w:w="120"/>
+            </w:tcMar>
+          </w:tcPr>
+          <w:p>
+            <w:pPr>
+              <w:jc w:val="left"/>
+            </w:pPr>
+            <w:r>
+              <w:rPr>
+                <w:b w:val="false"/>
+                <w:bCs w:val="false"/>
+                <w:color w:val="000000"/>
+                <w:sz w:val="20"/>
+                <w:szCs w:val="20"/>
+              </w:rPr>
+              <w:t xml:space="preserve">RUTA_ONEDRIVE en .env — opcional; sin configurar, no hace nada</w:t>
+            </w:r>
+          </w:p>
+        </w:tc>
+      </w:tr>
+      <w:tr>
+        <w:tc>
+          <w:tcPr>
+            <w:tcW w:type="dxa" w:w="2000"/>
+            <w:tcMar>
+              <w:top w:type="dxa" w:w="100"/>
+              <w:left w:type="dxa" w:w="120"/>
+              <w:bottom w:type="dxa" w:w="100"/>
+              <w:right w:type="dxa" w:w="120"/>
+            </w:tcMar>
+          </w:tcPr>
+          <w:p>
+            <w:pPr>
+              <w:jc w:val="left"/>
+            </w:pPr>
+            <w:r>
+              <w:rPr>
+                <w:b w:val="false"/>
+                <w:bCs w:val="false"/>
+                <w:color w:val="000000"/>
+                <w:sz w:val="20"/>
+                <w:szCs w:val="20"/>
+              </w:rPr>
+              <w:t xml:space="preserve">Verificación fuera-de-periodo en AlertOps</w:t>
+            </w:r>
+          </w:p>
+        </w:tc>
+        <w:tc>
+          <w:tcPr>
+            <w:tcW w:type="dxa" w:w="2000"/>
+            <w:shd w:fill="E2EFDA" w:val="clear"/>
+            <w:tcMar>
+              <w:top w:type="dxa" w:w="100"/>
+              <w:left w:type="dxa" w:w="120"/>
+              <w:bottom w:type="dxa" w:w="100"/>
+              <w:right w:type="dxa" w:w="120"/>
+            </w:tcMar>
+          </w:tcPr>
+          <w:p>
+            <w:pPr>
+              <w:jc w:val="left"/>
+            </w:pPr>
+            <w:r>
+              <w:rPr>
+                <w:b w:val="false"/>
+                <w:bCs w:val="false"/>
+                <w:color w:val="000000"/>
+                <w:sz w:val="20"/>
+                <w:szCs w:val="20"/>
+              </w:rPr>
+              <w:t xml:space="preserve">Listo</w:t>
+            </w:r>
+          </w:p>
+        </w:tc>
+        <w:tc>
+          <w:tcPr>
+            <w:tcW w:type="dxa" w:w="2000"/>
+            <w:tcMar>
+              <w:top w:type="dxa" w:w="100"/>
+              <w:left w:type="dxa" w:w="120"/>
+              <w:bottom w:type="dxa" w:w="100"/>
+              <w:right w:type="dxa" w:w="120"/>
+            </w:tcMar>
+          </w:tcPr>
+          <w:p>
+            <w:pPr>
+              <w:jc w:val="left"/>
+            </w:pPr>
+            <w:r>
+              <w:rPr>
+                <w:b w:val="false"/>
+                <w:bCs w:val="false"/>
+                <w:color w:val="000000"/>
+                <w:sz w:val="20"/>
+                <w:szCs w:val="20"/>
+              </w:rPr>
+              <w:t xml:space="preserve">Misma red de seguridad que ya tenía GLPI; probada con datos reales de mayo y junio</w:t>
+            </w:r>
+          </w:p>
+        </w:tc>
+      </w:tr>
     </w:tbl>
     <w:p>
       <w:pPr>
@@ -1517,6 +1841,136 @@
           <w:szCs w:val="21"/>
         </w:rPr>
         <w:t xml:space="preserve"> al documento; se confirmó en dos rondas que el problema deja de reproducirse.</w:t>
+      </w:r>
+    </w:p>
+    <w:p>
+      <w:pPr>
+        <w:pStyle w:val="ListParagraph"/>
+        <w:numPr>
+          <w:ilvl w:val="0"/>
+          <w:numId w:val="2"/>
+        </w:numPr>
+        <w:spacing w:after="100" w:line="290"/>
+      </w:pPr>
+      <w:r>
+        <w:rPr>
+          <w:b/>
+          <w:bCs/>
+          <w:sz w:val="21"/>
+          <w:szCs w:val="21"/>
+        </w:rPr>
+        <w:t xml:space="preserve">Restauración automática de lo guardado: </w:t>
+      </w:r>
+      <w:r>
+        <w:rPr>
+          <w:sz w:val="21"/>
+          <w:szCs w:val="21"/>
+        </w:rPr>
+        <w:t xml:space="preserve">antes había que apretar «Restaurar últimos informes» tras cada recarga del HTML; ahora el Consolidado, Logros y Mitigaciones cargados a mano se restauran solos al abrir — sin perder el histórico multi-mes de Casos/Indicadores/Disponibilidad en cada refresco.</w:t>
+      </w:r>
+    </w:p>
+    <w:p>
+      <w:pPr>
+        <w:pStyle w:val="ListParagraph"/>
+        <w:numPr>
+          <w:ilvl w:val="0"/>
+          <w:numId w:val="2"/>
+        </w:numPr>
+        <w:spacing w:after="100" w:line="290"/>
+      </w:pPr>
+      <w:r>
+        <w:rPr>
+          <w:b/>
+          <w:bCs/>
+          <w:sz w:val="21"/>
+          <w:szCs w:val="21"/>
+        </w:rPr>
+        <w:t xml:space="preserve">Mismo filtro por defecto en las cinco tarjetas con histórico: </w:t>
+      </w:r>
+      <w:r>
+        <w:rPr>
+          <w:sz w:val="21"/>
+          <w:szCs w:val="21"/>
+        </w:rPr>
+        <w:t xml:space="preserve">Casos, Indicadores, Disponibilidad global, Backups y Disponibilidad por CI abren todas en 3M la primera vez que se ve el informe — antes Backups y Disponibilidad por CI arrancaban en «Todo», la única tarjeta distinta del resto.</w:t>
+      </w:r>
+    </w:p>
+    <w:p>
+      <w:pPr>
+        <w:pStyle w:val="ListParagraph"/>
+        <w:numPr>
+          <w:ilvl w:val="0"/>
+          <w:numId w:val="2"/>
+        </w:numPr>
+        <w:spacing w:after="100" w:line="290"/>
+      </w:pPr>
+      <w:r>
+        <w:rPr>
+          <w:b/>
+          <w:bCs/>
+          <w:sz w:val="21"/>
+          <w:szCs w:val="21"/>
+        </w:rPr>
+        <w:t xml:space="preserve">Copia de resguardo automática del CSV original: </w:t>
+      </w:r>
+      <w:r>
+        <w:rPr>
+          <w:sz w:val="21"/>
+          <w:szCs w:val="21"/>
+        </w:rPr>
+        <w:t xml:space="preserve">cada extracción ya deja tres copias independientes del mismo archivo, ninguna derivada de otra por mutación: el original intacto en salida/, una copia igual de intacta en la carpeta que se declare en RUTA_ONEDRIVE (.env) — pensada para una carpeta sincronizada con OneDrive, para trazabilidad mensual sin depender de que alguien reenvíe el archivo — y la copia convertida que lee el informe. Sin RUTA_ONEDRIVE configurada, ese paso se omite sin error.</w:t>
+      </w:r>
+    </w:p>
+    <w:p>
+      <w:pPr>
+        <w:pStyle w:val="ListParagraph"/>
+        <w:numPr>
+          <w:ilvl w:val="0"/>
+          <w:numId w:val="2"/>
+        </w:numPr>
+        <w:spacing w:after="100" w:line="290"/>
+      </w:pPr>
+      <w:r>
+        <w:rPr>
+          <w:b/>
+          <w:bCs/>
+          <w:sz w:val="21"/>
+          <w:szCs w:val="21"/>
+        </w:rPr>
+        <w:t xml:space="preserve">AlertOps ya verifica que ningún registro caiga fuera del mes: </w:t>
+      </w:r>
+      <w:r>
+        <w:rPr>
+          <w:sz w:val="21"/>
+          <w:szCs w:val="21"/>
+        </w:rPr>
+        <w:t xml:space="preserve">igual que GLPI: antes solo comprobaba que hubiera al menos una alerta del periodo, no que todas lo estuvieran. Confirmado con datos reales: mayo (31 alertas, del 02 al 24) y junio (53 alertas, del 01 a las 14:49 al 30 a las 16:19 — el filtro cubre el día completo sin cortar el último).</w:t>
+      </w:r>
+    </w:p>
+    <w:p>
+      <w:pPr>
+        <w:pStyle w:val="ListParagraph"/>
+        <w:numPr>
+          <w:ilvl w:val="0"/>
+          <w:numId w:val="2"/>
+        </w:numPr>
+        <w:spacing w:after="100" w:line="290"/>
+      </w:pPr>
+      <w:r>
+        <w:rPr>
+          <w:b/>
+          <w:bCs/>
+          <w:sz w:val="21"/>
+          <w:szCs w:val="21"/>
+        </w:rPr>
+        <w:t xml:space="preserve">Lanzador de doble clic para Windows: </w:t>
+      </w:r>
+      <w:r>
+        <w:rPr>
+          <w:sz w:val="21"/>
+          <w:szCs w:val="21"/>
+        </w:rPr>
+        <w:t xml:space="preserve">ejecutar.bat / ejecutar.ps1 resuelven el intérprete de Python en este equipo (py -3 antes que python, para evitar el stub de la Microsoft Store que intercepta a python3) y corren actualizar_informe.py con las dos fuentes, sin exigir tocar la política de ejecución de PowerShell.</w:t>
       </w:r>
     </w:p>
     <w:p>
@@ -3523,14 +3977,14 @@
           <w:sz w:val="21"/>
           <w:szCs w:val="21"/>
         </w:rPr>
-        <w:t xml:space="preserve">Depósito automático en SharePoint/OneDrive. </w:t>
-      </w:r>
-      <w:r>
-        <w:rPr>
-          <w:sz w:val="21"/>
-          <w:szCs w:val="21"/>
-        </w:rPr>
-        <w:t xml:space="preserve">Hoy </w:t>
+        <w:t xml:space="preserve">Depósito automático del informe en SharePoint/OneDrive del cliente. </w:t>
+      </w:r>
+      <w:r>
+        <w:rPr>
+          <w:sz w:val="21"/>
+          <w:szCs w:val="21"/>
+        </w:rPr>
+        <w:t xml:space="preserve">Distinto de RUTA_ONEDRIVE (§2, ya resuelto — ese solo resguarda los CSV originales para trazabilidad interna): hoy </w:t>
       </w:r>
       <w:r>
         <w:rPr>
@@ -3545,7 +3999,7 @@
           <w:sz w:val="21"/>
           <w:szCs w:val="21"/>
         </w:rPr>
-        <w:t xml:space="preserve"> deja el insumo junto al HTML del equipo donde corre; falta que lo escriba directamente en la biblioteca del cliente.</w:t>
+        <w:t xml:space="preserve"> deja el insumo junto al HTML del equipo donde corre; falta que el informe mismo se escriba en la biblioteca del cliente.</w:t>
       </w:r>
     </w:p>
     <w:p>
@@ -5547,7 +6001,7 @@
                 <w:sz w:val="20"/>
                 <w:szCs w:val="20"/>
               </w:rPr>
-              <w:t xml:space="preserve">Credenciales de ambas fuentes. Fuera del repositorio de código (en .gitignore).</w:t>
+              <w:t xml:space="preserve">Credenciales de ambas fuentes, más RUTA_ONEDRIVE (opcional, para la copia de resguardo). Fuera del repositorio de código (en .gitignore).</w:t>
             </w:r>
           </w:p>
         </w:tc>
@@ -5656,6 +6110,116 @@
                 <w:szCs w:val="20"/>
               </w:rPr>
               <w:t xml:space="preserve">El informe. Carga ambas fuentes solo; caché resuelta con cabeceras no-cache.</w:t>
+            </w:r>
+          </w:p>
+        </w:tc>
+      </w:tr>
+      <w:tr>
+        <w:tc>
+          <w:tcPr>
+            <w:tcW w:type="dxa" w:w="2000"/>
+            <w:tcMar>
+              <w:top w:type="dxa" w:w="100"/>
+              <w:left w:type="dxa" w:w="120"/>
+              <w:bottom w:type="dxa" w:w="100"/>
+              <w:right w:type="dxa" w:w="120"/>
+            </w:tcMar>
+          </w:tcPr>
+          <w:p>
+            <w:pPr>
+              <w:jc w:val="left"/>
+            </w:pPr>
+            <w:r>
+              <w:rPr>
+                <w:rFonts w:ascii="Courier New" w:cs="Courier New" w:eastAsia="Courier New" w:hAnsi="Courier New"/>
+                <w:b w:val="false"/>
+                <w:bCs w:val="false"/>
+                <w:color w:val="000000"/>
+                <w:sz w:val="20"/>
+                <w:szCs w:val="20"/>
+              </w:rPr>
+              <w:t xml:space="preserve">automatizacion/ejecutar.bat</w:t>
+            </w:r>
+          </w:p>
+        </w:tc>
+        <w:tc>
+          <w:tcPr>
+            <w:tcW w:type="dxa" w:w="2000"/>
+            <w:tcMar>
+              <w:top w:type="dxa" w:w="100"/>
+              <w:left w:type="dxa" w:w="120"/>
+              <w:bottom w:type="dxa" w:w="100"/>
+              <w:right w:type="dxa" w:w="120"/>
+            </w:tcMar>
+          </w:tcPr>
+          <w:p>
+            <w:pPr>
+              <w:jc w:val="left"/>
+            </w:pPr>
+            <w:r>
+              <w:rPr>
+                <w:b w:val="false"/>
+                <w:bCs w:val="false"/>
+                <w:color w:val="000000"/>
+                <w:sz w:val="20"/>
+                <w:szCs w:val="20"/>
+              </w:rPr>
+              <w:t xml:space="preserve">Lanzador de doble clic en Windows sobre actualizar_informe.py; resuelve la política de ejecución de PowerShell y el intérprete de Python de este equipo.</w:t>
+            </w:r>
+          </w:p>
+        </w:tc>
+      </w:tr>
+      <w:tr>
+        <w:tc>
+          <w:tcPr>
+            <w:tcW w:type="dxa" w:w="2000"/>
+            <w:tcMar>
+              <w:top w:type="dxa" w:w="100"/>
+              <w:left w:type="dxa" w:w="120"/>
+              <w:bottom w:type="dxa" w:w="100"/>
+              <w:right w:type="dxa" w:w="120"/>
+            </w:tcMar>
+          </w:tcPr>
+          <w:p>
+            <w:pPr>
+              <w:jc w:val="left"/>
+            </w:pPr>
+            <w:r>
+              <w:rPr>
+                <w:rFonts w:ascii="Courier New" w:cs="Courier New" w:eastAsia="Courier New" w:hAnsi="Courier New"/>
+                <w:b w:val="false"/>
+                <w:bCs w:val="false"/>
+                <w:color w:val="000000"/>
+                <w:sz w:val="20"/>
+                <w:szCs w:val="20"/>
+              </w:rPr>
+              <w:t xml:space="preserve">automatizacion/ejecutar.ps1</w:t>
+            </w:r>
+          </w:p>
+        </w:tc>
+        <w:tc>
+          <w:tcPr>
+            <w:tcW w:type="dxa" w:w="2000"/>
+            <w:tcMar>
+              <w:top w:type="dxa" w:w="100"/>
+              <w:left w:type="dxa" w:w="120"/>
+              <w:bottom w:type="dxa" w:w="100"/>
+              <w:right w:type="dxa" w:w="120"/>
+            </w:tcMar>
+          </w:tcPr>
+          <w:p>
+            <w:pPr>
+              <w:jc w:val="left"/>
+            </w:pPr>
+            <w:r>
+              <w:rPr>
+                <w:b w:val="false"/>
+                <w:bCs w:val="false"/>
+                <w:color w:val="000000"/>
+                <w:sz w:val="20"/>
+                <w:szCs w:val="20"/>
+              </w:rPr>
+              <w:t xml:space="preserve">Envoltorio que invoca ejecutar.bat: prueba py -3 antes que python, y pasa --abrir para ver el resultado en pantalla.</w:t>
             </w:r>
           </w:p>
         </w:tc>

</xml_diff>